<commit_message>
user table structure created
</commit_message>
<xml_diff>
--- a/docs/EcocarbonX_Synopsis.docx
+++ b/docs/EcocarbonX_Synopsis.docx
@@ -3489,50 +3489,17 @@
       </w:pPr>
       <w:r>
         <w:rPr>
-          <w:color w:val="17365D"/>
-          <w:u w:val="thick" w:color="17365D"/>
+          <w:noProof/>
         </w:rPr>
         <w:lastRenderedPageBreak/>
-        <w:t>Flowchart/Algorithm:</w:t>
-      </w:r>
-    </w:p>
-    <w:p>
-      <w:pPr>
-        <w:pStyle w:val="BodyText"/>
-        <w:spacing w:before="8" w:line="276" w:lineRule="auto"/>
-        <w:jc w:val="both"/>
-        <w:rPr>
-          <w:color w:val="17365D"/>
-          <w:u w:val="thick" w:color="17365D"/>
-        </w:rPr>
-      </w:pPr>
-      <w:r>
-        <w:t xml:space="preserve">                           </w:t>
-      </w:r>
-    </w:p>
-    <w:p>
-      <w:pPr>
-        <w:pStyle w:val="Heading1"/>
-        <w:spacing w:before="243" w:line="276" w:lineRule="auto"/>
-        <w:ind w:left="0"/>
-        <w:jc w:val="both"/>
-        <w:rPr>
-          <w:color w:val="17365D"/>
-          <w:u w:val="thick" w:color="17365D"/>
-        </w:rPr>
-      </w:pPr>
-      <w:r>
-        <w:rPr>
-          <w:noProof/>
-        </w:rPr>
         <w:drawing>
-          <wp:anchor distT="0" distB="0" distL="114300" distR="114300" simplePos="0" relativeHeight="251658240" behindDoc="0" locked="0" layoutInCell="1" allowOverlap="1" wp14:anchorId="2BC27F0C" wp14:editId="51B2AF7D">
+          <wp:anchor distT="0" distB="0" distL="114300" distR="114300" simplePos="0" relativeHeight="251658240" behindDoc="0" locked="0" layoutInCell="1" allowOverlap="1" wp14:anchorId="2BC27F0C" wp14:editId="283AFC2D">
             <wp:simplePos x="0" y="0"/>
             <wp:positionH relativeFrom="column">
-              <wp:posOffset>518160</wp:posOffset>
+              <wp:posOffset>417714</wp:posOffset>
             </wp:positionH>
             <wp:positionV relativeFrom="paragraph">
-              <wp:posOffset>161290</wp:posOffset>
+              <wp:posOffset>0</wp:posOffset>
             </wp:positionV>
             <wp:extent cx="4600575" cy="6774180"/>
             <wp:effectExtent l="0" t="0" r="0" b="0"/>
@@ -3588,6 +3555,39 @@
           </wp:anchor>
         </w:drawing>
       </w:r>
+      <w:r>
+        <w:rPr>
+          <w:color w:val="17365D"/>
+          <w:u w:val="thick" w:color="17365D"/>
+        </w:rPr>
+        <w:t>Flowchart/Algorithm:</w:t>
+      </w:r>
+    </w:p>
+    <w:p>
+      <w:pPr>
+        <w:pStyle w:val="BodyText"/>
+        <w:spacing w:before="8" w:line="276" w:lineRule="auto"/>
+        <w:jc w:val="both"/>
+        <w:rPr>
+          <w:color w:val="17365D"/>
+          <w:u w:val="thick" w:color="17365D"/>
+        </w:rPr>
+      </w:pPr>
+      <w:r>
+        <w:t xml:space="preserve">                           </w:t>
+      </w:r>
+    </w:p>
+    <w:p>
+      <w:pPr>
+        <w:pStyle w:val="Heading1"/>
+        <w:spacing w:before="243" w:line="276" w:lineRule="auto"/>
+        <w:ind w:left="0"/>
+        <w:jc w:val="both"/>
+        <w:rPr>
+          <w:color w:val="17365D"/>
+          <w:u w:val="thick" w:color="17365D"/>
+        </w:rPr>
+      </w:pPr>
     </w:p>
     <w:p>
       <w:pPr>
@@ -3863,7 +3863,14 @@
           <w:rPr>
             <w:rStyle w:val="Hyperlink"/>
           </w:rPr>
-          <w:t>Indian Carbon Credit Trading Scheme | International Carbon Action Partnership</w:t>
+          <w:t xml:space="preserve">Indian Carbon Credit Trading Scheme | </w:t>
+        </w:r>
+        <w:r>
+          <w:rPr>
+            <w:rStyle w:val="Hyperlink"/>
+          </w:rPr>
+          <w:lastRenderedPageBreak/>
+          <w:t>International Carbon Action Partnership</w:t>
         </w:r>
       </w:hyperlink>
     </w:p>

</xml_diff>